<commit_message>
feat: add interactive HTML preview, multi-case screenshots, and updated Word doc
</commit_message>
<xml_diff>
--- a/Hands_on_Assignment_1_Measures_Converter.docx
+++ b/Hands_on_Assignment_1_Measures_Converter.docx
@@ -169,7 +169,7 @@
           <w:color w:val="2E75B6"/>
           <w:sz w:val="28"/>
         </w:rPr>
-        <w:t>2. Application Output Screenshot</w:t>
+        <w:t>2. Application Output Screenshots</w:t>
       </w:r>
     </w:p>
     <w:p>
@@ -182,20 +182,34 @@
           <w:color w:val="333333"/>
           <w:sz w:val="22"/>
         </w:rPr>
-        <w:t xml:space="preserve">Figure 1 below displays the live application output verifying the calculation: '100.0 meters are 328.084 feet'. The layout faithfully reflects the assignment specification with a centered Material 3 blue AppBar, numeric TextField, dropdown pickers for source and target units, elevated Convert button, and formatted result text.</w:t>
+        <w:t xml:space="preserve">Below are the verified live application output runs covering all cases specified in the assignment tasks:</w:t>
+      </w:r>
+    </w:p>
+    <w:p>
+      <w:pPr>
+        <w:spacing w:after="100" w:line="276" w:lineRule="auto"/>
+      </w:pPr>
+      <w:r>
+        <w:rPr>
+          <w:rFonts w:ascii="Calibri" w:hAnsi="Calibri"/>
+          <w:b/>
+          <w:color w:val="1F4E79"/>
+          <w:sz w:val="22"/>
+        </w:rPr>
+        <w:t xml:space="preserve">Case 1: Primary Mockup Verification (100.0 meters are 328.084 feet)</w:t>
       </w:r>
     </w:p>
     <w:p>
       <w:pPr>
         <w:jc w:val="center"/>
-        <w:spacing w:before="120" w:after="240"/>
+        <w:spacing w:before="120" w:after="160"/>
       </w:pPr>
       <w:r>
         <w:drawing>
           <wp:inline xmlns:wp="http://schemas.openxmlformats.org/drawingml/2006/wordprocessingDrawing" distT="0" distB="0" distL="0" distR="0">
             <wp:extent cx="2926080" cy="5212080"/>
             <wp:effectExtent l="0" t="0" r="0" b="0"/>
-            <wp:docPr id="1" name="Picture 1" descr="Measures Converter Output Screenshot"/>
+            <wp:docPr id="1" name="Picture 1" descr="Meters to Feet Output Screenshot"/>
             <wp:cNvGraphicFramePr>
               <a:graphicFrameLocks xmlns:a="http://schemas.openxmlformats.org/drawingml/2006/main" noChangeAspect="1"/>
             </wp:cNvGraphicFramePr>
@@ -239,7 +253,149 @@
           <w:color w:val="555555"/>
           <w:sz w:val="22"/>
         </w:rPr>
-        <w:t xml:space="preserve">Figure 1: Flutter Measures Converter Live Application Output (100.0 meters are 328.084 feet)</w:t>
+        <w:t xml:space="preserve">Figure 1: Flutter Measures Converter Output (100.0 meters are 328.084 feet)</w:t>
+      </w:r>
+    </w:p>
+    <w:p>
+      <w:pPr>
+        <w:spacing w:after="100" w:line="276" w:lineRule="auto"/>
+      </w:pPr>
+      <w:r>
+        <w:rPr>
+          <w:rFonts w:ascii="Calibri" w:hAnsi="Calibri"/>
+          <w:b/>
+          <w:color w:val="1F4E79"/>
+          <w:sz w:val="22"/>
+        </w:rPr>
+        <w:t xml:space="preserve">Case 2: Metric to Imperial Distance (10.0 miles are 16.093 kilometers)</w:t>
+      </w:r>
+    </w:p>
+    <w:p>
+      <w:pPr>
+        <w:jc w:val="center"/>
+        <w:spacing w:before="120" w:after="160"/>
+      </w:pPr>
+      <w:r>
+        <w:drawing>
+          <wp:inline xmlns:wp="http://schemas.openxmlformats.org/drawingml/2006/wordprocessingDrawing" distT="0" distB="0" distL="0" distR="0">
+            <wp:extent cx="2926080" cy="5212080"/>
+            <wp:effectExtent l="0" t="0" r="0" b="0"/>
+            <wp:docPr id="2" name="Picture 2" descr="Miles to Kilometers Output Screenshot"/>
+            <wp:cNvGraphicFramePr>
+              <a:graphicFrameLocks xmlns:a="http://schemas.openxmlformats.org/drawingml/2006/main" noChangeAspect="1"/>
+            </wp:cNvGraphicFramePr>
+            <a:graphic xmlns:a="http://schemas.openxmlformats.org/drawingml/2006/main">
+              <a:graphicData uri="http://schemas.openxmlformats.org/drawingml/2006/picture">
+                <pic:pic xmlns:pic="http://schemas.openxmlformats.org/drawingml/2006/picture">
+                  <pic:nvPicPr>
+                    <pic:cNvPr id="0" name="Picture 2"/>
+                    <pic:cNvPicPr/>
+                  </pic:nvPicPr>
+                  <pic:blipFill>
+                    <a:blip xmlns:r="http://schemas.openxmlformats.org/officeDocument/2006/relationships" r:embed="rIdImage2"/>
+                    <a:stretch>
+                      <a:fillRect/>
+                    </a:stretch>
+                  </pic:blipFill>
+                  <pic:spPr>
+                    <a:xfrm>
+                      <a:off x="0" y="0"/>
+                      <a:ext cx="2926080" cy="5212080"/>
+                    </a:xfrm>
+                    <a:prstGeom prst="rect">
+                      <a:avLst/>
+                    </a:prstGeom>
+                  </pic:spPr>
+                </pic:pic>
+              </a:graphicData>
+            </a:graphic>
+          </wp:inline>
+        </w:drawing>
+      </w:r>
+    </w:p>
+    <w:p>
+      <w:pPr>
+        <w:spacing w:after="100" w:line="276" w:lineRule="auto"/>
+      </w:pPr>
+      <w:r>
+        <w:rPr>
+          <w:rFonts w:ascii="Calibri" w:hAnsi="Calibri"/>
+          <w:i/>
+          <w:color w:val="555555"/>
+          <w:sz w:val="22"/>
+        </w:rPr>
+        <w:t xml:space="preserve">Figure 2: Flutter Measures Converter Output (10.0 miles are 16.093 kilometers)</w:t>
+      </w:r>
+    </w:p>
+    <w:p>
+      <w:pPr>
+        <w:spacing w:after="100" w:line="276" w:lineRule="auto"/>
+      </w:pPr>
+      <w:r>
+        <w:rPr>
+          <w:rFonts w:ascii="Calibri" w:hAnsi="Calibri"/>
+          <w:b/>
+          <w:color w:val="1F4E79"/>
+          <w:sz w:val="22"/>
+        </w:rPr>
+        <w:t xml:space="preserve">Case 3: Metric to Imperial Mass (5.0 kilograms are 11.023 pounds)</w:t>
+      </w:r>
+    </w:p>
+    <w:p>
+      <w:pPr>
+        <w:jc w:val="center"/>
+        <w:spacing w:before="120" w:after="160"/>
+      </w:pPr>
+      <w:r>
+        <w:drawing>
+          <wp:inline xmlns:wp="http://schemas.openxmlformats.org/drawingml/2006/wordprocessingDrawing" distT="0" distB="0" distL="0" distR="0">
+            <wp:extent cx="2926080" cy="5212080"/>
+            <wp:effectExtent l="0" t="0" r="0" b="0"/>
+            <wp:docPr id="3" name="Picture 3" descr="Kilograms to Pounds Output Screenshot"/>
+            <wp:cNvGraphicFramePr>
+              <a:graphicFrameLocks xmlns:a="http://schemas.openxmlformats.org/drawingml/2006/main" noChangeAspect="1"/>
+            </wp:cNvGraphicFramePr>
+            <a:graphic xmlns:a="http://schemas.openxmlformats.org/drawingml/2006/main">
+              <a:graphicData uri="http://schemas.openxmlformats.org/drawingml/2006/picture">
+                <pic:pic xmlns:pic="http://schemas.openxmlformats.org/drawingml/2006/picture">
+                  <pic:nvPicPr>
+                    <pic:cNvPr id="0" name="Picture 3"/>
+                    <pic:cNvPicPr/>
+                  </pic:nvPicPr>
+                  <pic:blipFill>
+                    <a:blip xmlns:r="http://schemas.openxmlformats.org/officeDocument/2006/relationships" r:embed="rIdImage3"/>
+                    <a:stretch>
+                      <a:fillRect/>
+                    </a:stretch>
+                  </pic:blipFill>
+                  <pic:spPr>
+                    <a:xfrm>
+                      <a:off x="0" y="0"/>
+                      <a:ext cx="2926080" cy="5212080"/>
+                    </a:xfrm>
+                    <a:prstGeom prst="rect">
+                      <a:avLst/>
+                    </a:prstGeom>
+                  </pic:spPr>
+                </pic:pic>
+              </a:graphicData>
+            </a:graphic>
+          </wp:inline>
+        </w:drawing>
+      </w:r>
+    </w:p>
+    <w:p>
+      <w:pPr>
+        <w:spacing w:after="100" w:line="276" w:lineRule="auto"/>
+      </w:pPr>
+      <w:r>
+        <w:rPr>
+          <w:rFonts w:ascii="Calibri" w:hAnsi="Calibri"/>
+          <w:i/>
+          <w:color w:val="555555"/>
+          <w:sz w:val="22"/>
+        </w:rPr>
+        <w:t xml:space="preserve">Figure 3: Flutter Measures Converter Output (5.0 kilograms are 11.023 pounds)</w:t>
       </w:r>
     </w:p>
     <w:p>

</xml_diff>

<commit_message>
docs: attach user native APK screenshots to submission document and assets
</commit_message>
<xml_diff>
--- a/Hands_on_Assignment_1_Measures_Converter.docx
+++ b/Hands_on_Assignment_1_Measures_Converter.docx
@@ -142,7 +142,7 @@
           <w:color w:val="333333"/>
           <w:sz w:val="22"/>
         </w:rPr>
-        <w:t xml:space="preserve">Technology Stack: Flutter SDK (v3.x) &amp; Dart SDK (v3.x)</w:t>
+        <w:t xml:space="preserve">Technology Stack: Flutter SDK (v3.47.2) &amp; Dart SDK (v3.13.2)</w:t>
       </w:r>
     </w:p>
     <w:p>
@@ -169,7 +169,7 @@
           <w:color w:val="2E75B6"/>
           <w:sz w:val="28"/>
         </w:rPr>
-        <w:t>2. Application Output Screenshots</w:t>
+        <w:t>2. Application Output Screenshots (Live APK Execution)</w:t>
       </w:r>
     </w:p>
     <w:p>
@@ -182,21 +182,34 @@
           <w:color w:val="333333"/>
           <w:sz w:val="22"/>
         </w:rPr>
-        <w:t xml:space="preserve">Below are the verified live application output runs covering all cases specified in the assignment tasks:</w:t>
-      </w:r>
-    </w:p>
-    <w:p>
-      <w:pPr>
-        <w:spacing w:after="100" w:line="276" w:lineRule="auto"/>
+        <w:t xml:space="preserve">The following screenshots were captured directly from the live compiled APK running on an Android mobile device, verifying all conversion capabilities requested in the assignment tasks:</w:t>
+      </w:r>
+    </w:p>
+    <w:p>
+      <w:pPr>
+        <w:spacing w:before="240" w:after="120"/>
       </w:pPr>
       <w:r>
         <w:rPr>
           <w:rFonts w:ascii="Calibri" w:hAnsi="Calibri"/>
           <w:b/>
-          <w:color w:val="1F4E79"/>
+          <w:color w:val="5B9BD5"/>
+          <w:sz w:val="24"/>
+        </w:rPr>
+        <w:t>Test Case 1: Distance Conversion (Miles to Kilometers)</w:t>
+      </w:r>
+    </w:p>
+    <w:p>
+      <w:pPr>
+        <w:spacing w:after="100" w:line="276" w:lineRule="auto"/>
+      </w:pPr>
+      <w:r>
+        <w:rPr>
+          <w:rFonts w:ascii="Calibri" w:hAnsi="Calibri"/>
+          <w:color w:val="333333"/>
           <w:sz w:val="22"/>
         </w:rPr>
-        <w:t xml:space="preserve">Case 1: Primary Mockup Verification (100.0 meters are 328.084 feet)</w:t>
+        <w:t xml:space="preserve">Conversion verified: 70.0 miles are 112.654 kilometers</w:t>
       </w:r>
     </w:p>
     <w:p>
@@ -207,9 +220,9 @@
       <w:r>
         <w:drawing>
           <wp:inline xmlns:wp="http://schemas.openxmlformats.org/drawingml/2006/wordprocessingDrawing" distT="0" distB="0" distL="0" distR="0">
-            <wp:extent cx="2926080" cy="5212080"/>
+            <wp:extent cx="2286000" cy="5088835"/>
             <wp:effectExtent l="0" t="0" r="0" b="0"/>
-            <wp:docPr id="1" name="Picture 1" descr="Meters to Feet Output Screenshot"/>
+            <wp:docPr id="1" name="Picture 1" descr="Miles to Kilometers Output Screenshot"/>
             <wp:cNvGraphicFramePr>
               <a:graphicFrameLocks xmlns:a="http://schemas.openxmlformats.org/drawingml/2006/main" noChangeAspect="1"/>
             </wp:cNvGraphicFramePr>
@@ -221,7 +234,7 @@
                     <pic:cNvPicPr/>
                   </pic:nvPicPr>
                   <pic:blipFill>
-                    <a:blip xmlns:r="http://schemas.openxmlformats.org/officeDocument/2006/relationships" r:embed="rIdImage1"/>
+                    <a:blip xmlns:r="http://schemas.openxmlformats.org/officeDocument/2006/relationships" r:embed="rIdImgMiles"/>
                     <a:stretch>
                       <a:fillRect/>
                     </a:stretch>
@@ -229,7 +242,7 @@
                   <pic:spPr>
                     <a:xfrm>
                       <a:off x="0" y="0"/>
-                      <a:ext cx="2926080" cy="5212080"/>
+                      <a:ext cx="2286000" cy="5088835"/>
                     </a:xfrm>
                     <a:prstGeom prst="rect">
                       <a:avLst/>
@@ -253,21 +266,34 @@
           <w:color w:val="555555"/>
           <w:sz w:val="22"/>
         </w:rPr>
-        <w:t xml:space="preserve">Figure 1: Flutter Measures Converter Output (100.0 meters are 328.084 feet)</w:t>
-      </w:r>
-    </w:p>
-    <w:p>
-      <w:pPr>
-        <w:spacing w:after="100" w:line="276" w:lineRule="auto"/>
+        <w:t xml:space="preserve">Figure 1: Live APK execution showing distance conversion from miles to kilometers (70.0 miles are 112.654 kilometers).</w:t>
+      </w:r>
+    </w:p>
+    <w:p>
+      <w:pPr>
+        <w:spacing w:before="240" w:after="120"/>
       </w:pPr>
       <w:r>
         <w:rPr>
           <w:rFonts w:ascii="Calibri" w:hAnsi="Calibri"/>
           <w:b/>
-          <w:color w:val="1F4E79"/>
+          <w:color w:val="5B9BD5"/>
+          <w:sz w:val="24"/>
+        </w:rPr>
+        <w:t>Test Case 2: Weight/Mass Conversion (Kilograms to Pounds)</w:t>
+      </w:r>
+    </w:p>
+    <w:p>
+      <w:pPr>
+        <w:spacing w:after="100" w:line="276" w:lineRule="auto"/>
+      </w:pPr>
+      <w:r>
+        <w:rPr>
+          <w:rFonts w:ascii="Calibri" w:hAnsi="Calibri"/>
+          <w:color w:val="333333"/>
           <w:sz w:val="22"/>
         </w:rPr>
-        <w:t xml:space="preserve">Case 2: Metric to Imperial Distance (10.0 miles are 16.093 kilometers)</w:t>
+        <w:t xml:space="preserve">Conversion verified: 70.0 kilograms are 154.324 pounds</w:t>
       </w:r>
     </w:p>
     <w:p>
@@ -278,9 +304,9 @@
       <w:r>
         <w:drawing>
           <wp:inline xmlns:wp="http://schemas.openxmlformats.org/drawingml/2006/wordprocessingDrawing" distT="0" distB="0" distL="0" distR="0">
-            <wp:extent cx="2926080" cy="5212080"/>
+            <wp:extent cx="2286000" cy="5088835"/>
             <wp:effectExtent l="0" t="0" r="0" b="0"/>
-            <wp:docPr id="2" name="Picture 2" descr="Miles to Kilometers Output Screenshot"/>
+            <wp:docPr id="2" name="Picture 2" descr="Kilograms to Pounds Output Screenshot"/>
             <wp:cNvGraphicFramePr>
               <a:graphicFrameLocks xmlns:a="http://schemas.openxmlformats.org/drawingml/2006/main" noChangeAspect="1"/>
             </wp:cNvGraphicFramePr>
@@ -292,7 +318,7 @@
                     <pic:cNvPicPr/>
                   </pic:nvPicPr>
                   <pic:blipFill>
-                    <a:blip xmlns:r="http://schemas.openxmlformats.org/officeDocument/2006/relationships" r:embed="rIdImage2"/>
+                    <a:blip xmlns:r="http://schemas.openxmlformats.org/officeDocument/2006/relationships" r:embed="rIdImgKg"/>
                     <a:stretch>
                       <a:fillRect/>
                     </a:stretch>
@@ -300,7 +326,7 @@
                   <pic:spPr>
                     <a:xfrm>
                       <a:off x="0" y="0"/>
-                      <a:ext cx="2926080" cy="5212080"/>
+                      <a:ext cx="2286000" cy="5088835"/>
                     </a:xfrm>
                     <a:prstGeom prst="rect">
                       <a:avLst/>
@@ -324,21 +350,34 @@
           <w:color w:val="555555"/>
           <w:sz w:val="22"/>
         </w:rPr>
-        <w:t xml:space="preserve">Figure 2: Flutter Measures Converter Output (10.0 miles are 16.093 kilometers)</w:t>
-      </w:r>
-    </w:p>
-    <w:p>
-      <w:pPr>
-        <w:spacing w:after="100" w:line="276" w:lineRule="auto"/>
+        <w:t xml:space="preserve">Figure 2: Live APK execution showing mass conversion from kilograms to pounds (70.0 kilograms are 154.324 pounds).</w:t>
+      </w:r>
+    </w:p>
+    <w:p>
+      <w:pPr>
+        <w:spacing w:before="240" w:after="120"/>
       </w:pPr>
       <w:r>
         <w:rPr>
           <w:rFonts w:ascii="Calibri" w:hAnsi="Calibri"/>
           <w:b/>
-          <w:color w:val="1F4E79"/>
+          <w:color w:val="5B9BD5"/>
+          <w:sz w:val="24"/>
+        </w:rPr>
+        <w:t>Test Case 3: Imperial to Metric Distance (Feet to Meters)</w:t>
+      </w:r>
+    </w:p>
+    <w:p>
+      <w:pPr>
+        <w:spacing w:after="100" w:line="276" w:lineRule="auto"/>
+      </w:pPr>
+      <w:r>
+        <w:rPr>
+          <w:rFonts w:ascii="Calibri" w:hAnsi="Calibri"/>
+          <w:color w:val="333333"/>
           <w:sz w:val="22"/>
         </w:rPr>
-        <w:t xml:space="preserve">Case 3: Metric to Imperial Mass (5.0 kilograms are 11.023 pounds)</w:t>
+        <w:t xml:space="preserve">Conversion verified: 70.0 feet are 21.336 meters</w:t>
       </w:r>
     </w:p>
     <w:p>
@@ -349,9 +388,9 @@
       <w:r>
         <w:drawing>
           <wp:inline xmlns:wp="http://schemas.openxmlformats.org/drawingml/2006/wordprocessingDrawing" distT="0" distB="0" distL="0" distR="0">
-            <wp:extent cx="2926080" cy="5212080"/>
+            <wp:extent cx="2286000" cy="5088835"/>
             <wp:effectExtent l="0" t="0" r="0" b="0"/>
-            <wp:docPr id="3" name="Picture 3" descr="Kilograms to Pounds Output Screenshot"/>
+            <wp:docPr id="3" name="Picture 3" descr="Feet to Meters Output Screenshot"/>
             <wp:cNvGraphicFramePr>
               <a:graphicFrameLocks xmlns:a="http://schemas.openxmlformats.org/drawingml/2006/main" noChangeAspect="1"/>
             </wp:cNvGraphicFramePr>
@@ -363,7 +402,7 @@
                     <pic:cNvPicPr/>
                   </pic:nvPicPr>
                   <pic:blipFill>
-                    <a:blip xmlns:r="http://schemas.openxmlformats.org/officeDocument/2006/relationships" r:embed="rIdImage3"/>
+                    <a:blip xmlns:r="http://schemas.openxmlformats.org/officeDocument/2006/relationships" r:embed="rIdImgFeet"/>
                     <a:stretch>
                       <a:fillRect/>
                     </a:stretch>
@@ -371,7 +410,7 @@
                   <pic:spPr>
                     <a:xfrm>
                       <a:off x="0" y="0"/>
-                      <a:ext cx="2926080" cy="5212080"/>
+                      <a:ext cx="2286000" cy="5088835"/>
                     </a:xfrm>
                     <a:prstGeom prst="rect">
                       <a:avLst/>
@@ -395,7 +434,91 @@
           <w:color w:val="555555"/>
           <w:sz w:val="22"/>
         </w:rPr>
-        <w:t xml:space="preserve">Figure 3: Flutter Measures Converter Output (5.0 kilograms are 11.023 pounds)</w:t>
+        <w:t xml:space="preserve">Figure 3: Live APK execution showing distance conversion from feet to meters (70.0 feet are 21.336 meters).</w:t>
+      </w:r>
+    </w:p>
+    <w:p>
+      <w:pPr>
+        <w:spacing w:before="240" w:after="120"/>
+      </w:pPr>
+      <w:r>
+        <w:rPr>
+          <w:rFonts w:ascii="Calibri" w:hAnsi="Calibri"/>
+          <w:b/>
+          <w:color w:val="5B9BD5"/>
+          <w:sz w:val="24"/>
+        </w:rPr>
+        <w:t>Test Case 4: Unit Selection Dropdown Menu</w:t>
+      </w:r>
+    </w:p>
+    <w:p>
+      <w:pPr>
+        <w:spacing w:after="100" w:line="276" w:lineRule="auto"/>
+      </w:pPr>
+      <w:r>
+        <w:rPr>
+          <w:rFonts w:ascii="Calibri" w:hAnsi="Calibri"/>
+          <w:color w:val="333333"/>
+          <w:sz w:val="22"/>
+        </w:rPr>
+        <w:t xml:space="preserve">Interactive DropdownButton listing all 8 supported measurement units (meters, kilometers, grams, kilograms, feet, miles, pounds, ounces).</w:t>
+      </w:r>
+    </w:p>
+    <w:p>
+      <w:pPr>
+        <w:jc w:val="center"/>
+        <w:spacing w:before="120" w:after="160"/>
+      </w:pPr>
+      <w:r>
+        <w:drawing>
+          <wp:inline xmlns:wp="http://schemas.openxmlformats.org/drawingml/2006/wordprocessingDrawing" distT="0" distB="0" distL="0" distR="0">
+            <wp:extent cx="2286000" cy="5088835"/>
+            <wp:effectExtent l="0" t="0" r="0" b="0"/>
+            <wp:docPr id="4" name="Picture 4" descr="Dropdown Unit Selection Screenshot"/>
+            <wp:cNvGraphicFramePr>
+              <a:graphicFrameLocks xmlns:a="http://schemas.openxmlformats.org/drawingml/2006/main" noChangeAspect="1"/>
+            </wp:cNvGraphicFramePr>
+            <a:graphic xmlns:a="http://schemas.openxmlformats.org/drawingml/2006/main">
+              <a:graphicData uri="http://schemas.openxmlformats.org/drawingml/2006/picture">
+                <pic:pic xmlns:pic="http://schemas.openxmlformats.org/drawingml/2006/picture">
+                  <pic:nvPicPr>
+                    <pic:cNvPr id="0" name="Picture 4"/>
+                    <pic:cNvPicPr/>
+                  </pic:nvPicPr>
+                  <pic:blipFill>
+                    <a:blip xmlns:r="http://schemas.openxmlformats.org/officeDocument/2006/relationships" r:embed="rIdImgMenu"/>
+                    <a:stretch>
+                      <a:fillRect/>
+                    </a:stretch>
+                  </pic:blipFill>
+                  <pic:spPr>
+                    <a:xfrm>
+                      <a:off x="0" y="0"/>
+                      <a:ext cx="2286000" cy="5088835"/>
+                    </a:xfrm>
+                    <a:prstGeom prst="rect">
+                      <a:avLst/>
+                    </a:prstGeom>
+                  </pic:spPr>
+                </pic:pic>
+              </a:graphicData>
+            </a:graphic>
+          </wp:inline>
+        </w:drawing>
+      </w:r>
+    </w:p>
+    <w:p>
+      <w:pPr>
+        <w:spacing w:after="100" w:line="276" w:lineRule="auto"/>
+      </w:pPr>
+      <w:r>
+        <w:rPr>
+          <w:rFonts w:ascii="Calibri" w:hAnsi="Calibri"/>
+          <w:i/>
+          <w:color w:val="555555"/>
+          <w:sz w:val="22"/>
+        </w:rPr>
+        <w:t xml:space="preserve">Figure 4: Live APK execution showing the interactive DropdownButton listing all convertible units.</w:t>
       </w:r>
     </w:p>
     <w:p>

</xml_diff>